<commit_message>
docs: informe final con capturas de producción (.md/.docx/.pdf), resumen de una página y estado terminado
Co-Authored-By: Claude Opus 5.5 <noreply@anthropic.com>
</commit_message>
<xml_diff>
--- a/docs/informe/INFORME.docx
+++ b/docs/informe/INFORME.docx
@@ -12415,12 +12415,12 @@
           <wp:inline>
             <wp:extent cx="5334000" cy="3000375"/>
             <wp:effectExtent b="0" l="0" r="0" t="0"/>
-            <wp:docPr descr="Figura 1. Pantalla principal de RutaQ en navegador de escritorio con la red vial de Quetzaltenango (24 cabeceras) y panel de análisis sincronizado." title="" id="38" name="Picture"/>
+            <wp:docPr descr="Figura 1. Consulta F3 en la versión desplegada: ruta más corta de Quetzaltenango a Coatepeque (59.9 km) sobre la red vial de 24 cabeceras." title="" id="38" name="Picture"/>
             <a:graphic>
               <a:graphicData uri="http://schemas.openxmlformats.org/drawingml/2006/picture">
                 <pic:pic>
                   <pic:nvPicPr>
-                    <pic:cNvPr descr="capturas/desktop-chrome-02-quetzaltenango.png" id="39" name="Picture"/>
+                    <pic:cNvPr descr="capturas/desktop-chrome-00-f3-quetzaltenango-coatepeque.png" id="39" name="Picture"/>
                     <pic:cNvPicPr>
                       <a:picLocks noChangeArrowheads="1" noChangeAspect="1"/>
                     </pic:cNvPicPr>
@@ -12458,7 +12458,7 @@
         <w:pStyle w:val="ImageCaption"/>
       </w:pPr>
       <w:r>
-        <w:t xml:space="preserve">Figura 1. Pantalla principal de RutaQ en navegador de escritorio con la red vial de Quetzaltenango (24 cabeceras) y panel de análisis sincronizado.</w:t>
+        <w:t xml:space="preserve">Figura 1. Consulta F3 en la versión desplegada: ruta más corta de Quetzaltenango a Coatepeque (59.9 km) sobre la red vial de 24 cabeceras.</w:t>
       </w:r>
     </w:p>
     <w:p>
@@ -12466,7 +12466,7 @@
         <w:pStyle w:val="BodyText"/>
       </w:pPr>
       <w:r>
-        <w:t xml:space="preserve">En la barra superior se aprecian los selectores de modo («Quetzaltenango» activo en color azul y «Diseño»), la lista desplegable de plantillas preconfiguradas («Plantilla: Quetzaltenango (24 muns)») y los botones de acción para «Cargar», «Guardar», exportación «PNG» y maximizado. En la barra de control secundaria se ubican las acciones algorítmicas («Árbol (F2)», «Ruta (F3)», «Limpiar») y el selector de nodo origen («Quetzaltenango»), acompañados de las insignias de escala («Escala: 1-100») y compensación bidimensional («Ajuste 2D: 0%»). El lienzo interactivo renderiza los 24 vértices municipales interconectados por las 55 aristas viales con sus respectivos kilometrajes y controles de navegación en la esquina inferior izquierda. A la derecha, el panel sincronizado expone la pestaña «Gráfica (S2)» con la leyenda visual de estados y la tarjeta de escala geométrica reportando ~12 px / km.</w:t>
+        <w:t xml:space="preserve">En la barra superior se aprecian el modo «Quetzaltenango» activo, la plantilla «Quetzaltenango (24 muns)» y las acciones «Cargar», «Guardar» y «PNG». En la barra de consulta está activa «Ruta (F3)» con origen «Quetzaltenango», destino «Coatepeque» y la distancia mínima «59.9 km», junto a las insignias «Escala: 1–100» y «Ajuste 2D: 0%». En el lienzo, los municipios conservan su disposición geográfica (altiplano al norte, Costa Cuca al sur); la ruta mínima se resalta en morado, con el origen en verde y el destino en rojo, y cada arista muestra su peso en kilómetros. A la derecha, la pestaña «Gráfica (S2)» resume la consulta: «Distancia Total: 59.9 km», «5 tramos» y la secuencia Quetzaltenango → La Esperanza → San Mateo → Concepción Chiquirichapa → San Martín Sacatepéquez → Coatepeque, seguida de la leyenda de estados y la tarjeta de escala (~12 px por km).</w:t>
       </w:r>
     </w:p>
     <w:p>

</xml_diff>

<commit_message>
docs(proyecto2): generar documento academico oficial, capturas, anexo de codigo y exportacion PDF/DOCX
</commit_message>
<xml_diff>
--- a/docs/informe/INFORME.docx
+++ b/docs/informe/INFORME.docx
@@ -106,10 +106,7 @@
         <w:t xml:space="preserve"> </w:t>
       </w:r>
       <w:r>
-        <w:rPr>
-          <w:rStyle w:val="VerbatimChar"/>
-        </w:rPr>
-        <w:t xml:space="preserve">________________________________________</w:t>
+        <w:t xml:space="preserve">Investigación de Operaciones</w:t>
       </w:r>
       <w:r>
         <w:br/>
@@ -125,44 +122,41 @@
         <w:t xml:space="preserve"> </w:t>
       </w:r>
       <w:r>
-        <w:rPr>
-          <w:rStyle w:val="VerbatimChar"/>
-        </w:rPr>
-        <w:t xml:space="preserve">________________________________________</w:t>
-      </w:r>
-    </w:p>
-    <w:p>
-      <w:pPr>
-        <w:pStyle w:val="BodyText"/>
-      </w:pPr>
+        <w:t xml:space="preserve">Ing. Samuel Isaac Gómez Moreno</w:t>
+      </w:r>
+      <w:r>
+        <w:br/>
+      </w:r>
       <w:r>
         <w:rPr>
           <w:b/>
           <w:bCs/>
         </w:rPr>
-        <w:t xml:space="preserve">Estudiante:</w:t>
-      </w:r>
-      <w:r>
-        <w:t xml:space="preserve"> </w:t>
-      </w:r>
-      <w:r>
-        <w:t xml:space="preserve">Cristopher Alexis Castellanos Paz</w:t>
-      </w:r>
-      <w:r>
-        <w:br/>
-      </w:r>
+        <w:t xml:space="preserve">Semestre y Carrera:</w:t>
+      </w:r>
+      <w:r>
+        <w:t xml:space="preserve"> </w:t>
+      </w:r>
+      <w:r>
+        <w:t xml:space="preserve">6.º semestre, Ingeniería en Sistemas</w:t>
+      </w:r>
+    </w:p>
+    <w:p>
+      <w:pPr>
+        <w:pStyle w:val="BodyText"/>
+      </w:pPr>
       <w:r>
         <w:rPr>
           <w:b/>
           <w:bCs/>
         </w:rPr>
-        <w:t xml:space="preserve">Carné:</w:t>
-      </w:r>
-      <w:r>
-        <w:t xml:space="preserve"> </w:t>
-      </w:r>
-      <w:r>
-        <w:t xml:space="preserve">2690245972</w:t>
+        <w:t xml:space="preserve">Estudiante:</w:t>
+      </w:r>
+      <w:r>
+        <w:t xml:space="preserve"> </w:t>
+      </w:r>
+      <w:r>
+        <w:t xml:space="preserve">Cristopher Alexis Castellanos Paz</w:t>
       </w:r>
       <w:r>
         <w:br/>
@@ -172,13 +166,13 @@
           <w:b/>
           <w:bCs/>
         </w:rPr>
-        <w:t xml:space="preserve">Carrera:</w:t>
-      </w:r>
-      <w:r>
-        <w:t xml:space="preserve"> </w:t>
-      </w:r>
-      <w:r>
-        <w:t xml:space="preserve">Ingeniería en Sistemas de Información y Ciencias de la Computación</w:t>
+        <w:t xml:space="preserve">Carné:</w:t>
+      </w:r>
+      <w:r>
+        <w:t xml:space="preserve"> </w:t>
+      </w:r>
+      <w:r>
+        <w:t xml:space="preserve">2690-24-5972</w:t>
       </w:r>
       <w:r>
         <w:br/>

</xml_diff>